<commit_message>
Refresh quick reference documents from live site content
</commit_message>
<xml_diff>
--- a/1 Day PC Video Quick Reference.docx
+++ b/1 Day PC Video Quick Reference.docx
@@ -33,11 +33,11 @@
         <w:tblLook w:val="04A0" w:firstRow="1" w:lastRow="0" w:firstColumn="1" w:lastColumn="0" w:noHBand="0" w:noVBand="1"/>
       </w:tblPr>
       <w:tblGrid>
-        <w:gridCol w:w="2448"/>
-        <w:gridCol w:w="1296"/>
-        <w:gridCol w:w="1296"/>
-        <w:gridCol w:w="3888"/>
-        <w:gridCol w:w="4176"/>
+        <w:gridCol w:w="2880"/>
+        <w:gridCol w:w="1440"/>
+        <w:gridCol w:w="1440"/>
+        <w:gridCol w:w="4320"/>
+        <w:gridCol w:w="5040"/>
       </w:tblGrid>
       <w:tr>
         <w:trPr>
@@ -45,7 +45,7 @@
         </w:trPr>
         <w:tc>
           <w:tcPr>
-            <w:tcW w:w="2448" w:type="dxa"/>
+            <w:tcW w:w="2880" w:type="dxa"/>
             <w:shd w:val="clear" w:color="auto" w:fill="E9DDF2"/>
           </w:tcPr>
           <w:p>
@@ -61,7 +61,7 @@
         </w:tc>
         <w:tc>
           <w:tcPr>
-            <w:tcW w:w="1296" w:type="dxa"/>
+            <w:tcW w:w="1440" w:type="dxa"/>
             <w:shd w:val="clear" w:color="auto" w:fill="E9DDF2"/>
           </w:tcPr>
           <w:p>
@@ -77,7 +77,7 @@
         </w:tc>
         <w:tc>
           <w:tcPr>
-            <w:tcW w:w="1296" w:type="dxa"/>
+            <w:tcW w:w="1440" w:type="dxa"/>
             <w:shd w:val="clear" w:color="auto" w:fill="E9DDF2"/>
           </w:tcPr>
           <w:p>
@@ -93,7 +93,7 @@
         </w:tc>
         <w:tc>
           <w:tcPr>
-            <w:tcW w:w="3888" w:type="dxa"/>
+            <w:tcW w:w="4320" w:type="dxa"/>
             <w:shd w:val="clear" w:color="auto" w:fill="E9DDF2"/>
           </w:tcPr>
           <w:p>
@@ -109,7 +109,7 @@
         </w:tc>
         <w:tc>
           <w:tcPr>
-            <w:tcW w:w="4176" w:type="dxa"/>
+            <w:tcW w:w="5040" w:type="dxa"/>
             <w:shd w:val="clear" w:color="auto" w:fill="E9DDF2"/>
           </w:tcPr>
           <w:p>
@@ -130,7 +130,7 @@
         </w:trPr>
         <w:tc>
           <w:tcPr>
-            <w:tcW w:w="2448" w:type="dxa"/>
+            <w:tcW w:w="2880" w:type="dxa"/>
           </w:tcPr>
           <w:p>
             <w:r>
@@ -144,7 +144,7 @@
         </w:tc>
         <w:tc>
           <w:tcPr>
-            <w:tcW w:w="1296" w:type="dxa"/>
+            <w:tcW w:w="1440" w:type="dxa"/>
           </w:tcPr>
           <w:p>
             <w:r>
@@ -158,7 +158,7 @@
         </w:tc>
         <w:tc>
           <w:tcPr>
-            <w:tcW w:w="1296" w:type="dxa"/>
+            <w:tcW w:w="1440" w:type="dxa"/>
           </w:tcPr>
           <w:p>
             <w:r>
@@ -172,7 +172,7 @@
         </w:tc>
         <w:tc>
           <w:tcPr>
-            <w:tcW w:w="3888" w:type="dxa"/>
+            <w:tcW w:w="4320" w:type="dxa"/>
           </w:tcPr>
           <w:p>
             <w:r>
@@ -186,7 +186,7 @@
         </w:tc>
         <w:tc>
           <w:tcPr>
-            <w:tcW w:w="4176" w:type="dxa"/>
+            <w:tcW w:w="5040" w:type="dxa"/>
           </w:tcPr>
           <w:p>
             <w:pPr>
@@ -197,7 +197,7 @@
                 <w:rFonts w:ascii="Manrope" w:hAnsi="Manrope"/>
                 <w:sz w:val="20"/>
               </w:rPr>
-              <w:t>Language shapes identity, dignity, and self-understanding.</w:t>
+              <w:t>Explores how language shapes identity, dignity, and self-understanding.</w:t>
             </w:r>
           </w:p>
           <w:p>
@@ -209,7 +209,7 @@
                 <w:rFonts w:ascii="Manrope" w:hAnsi="Manrope"/>
                 <w:sz w:val="20"/>
               </w:rPr>
-              <w:t>Identity-first and person-first language can reflect different perspectives and preferences.</w:t>
+              <w:t>Contrasts identity-first language (e.g. 'autistic person') and person-first language (e.g. 'person with autism') from an autistic perspective.</w:t>
             </w:r>
           </w:p>
           <w:p>
@@ -221,7 +221,7 @@
                 <w:rFonts w:ascii="Manrope" w:hAnsi="Manrope"/>
                 <w:sz w:val="20"/>
               </w:rPr>
-              <w:t>Individual preference should guide respectful language choices.</w:t>
+              <w:t>Encourages listening to individual preference rather than assuming one correct term for everyone.</w:t>
             </w:r>
           </w:p>
         </w:tc>
@@ -232,7 +232,7 @@
         </w:trPr>
         <w:tc>
           <w:tcPr>
-            <w:tcW w:w="2448" w:type="dxa"/>
+            <w:tcW w:w="2880" w:type="dxa"/>
           </w:tcPr>
           <w:p>
             <w:r>
@@ -246,7 +246,7 @@
         </w:tc>
         <w:tc>
           <w:tcPr>
-            <w:tcW w:w="1296" w:type="dxa"/>
+            <w:tcW w:w="1440" w:type="dxa"/>
           </w:tcPr>
           <w:p>
             <w:r>
@@ -260,7 +260,7 @@
         </w:tc>
         <w:tc>
           <w:tcPr>
-            <w:tcW w:w="1296" w:type="dxa"/>
+            <w:tcW w:w="1440" w:type="dxa"/>
           </w:tcPr>
           <w:p>
             <w:r>
@@ -274,7 +274,7 @@
         </w:tc>
         <w:tc>
           <w:tcPr>
-            <w:tcW w:w="3888" w:type="dxa"/>
+            <w:tcW w:w="4320" w:type="dxa"/>
           </w:tcPr>
           <w:p>
             <w:r>
@@ -288,7 +288,7 @@
         </w:tc>
         <w:tc>
           <w:tcPr>
-            <w:tcW w:w="4176" w:type="dxa"/>
+            <w:tcW w:w="5040" w:type="dxa"/>
           </w:tcPr>
           <w:p>
             <w:pPr>
@@ -299,7 +299,7 @@
                 <w:rFonts w:ascii="Manrope" w:hAnsi="Manrope"/>
                 <w:sz w:val="20"/>
               </w:rPr>
-              <w:t>The young person should be treated as an active contributor to learning decisions.</w:t>
+              <w:t>Centres the young person as an active contributor to learning decisions.</w:t>
             </w:r>
           </w:p>
           <w:p>
@@ -311,7 +311,7 @@
                 <w:rFonts w:ascii="Manrope" w:hAnsi="Manrope"/>
                 <w:sz w:val="20"/>
               </w:rPr>
-              <w:t>Adults need to ask how a student learns rather than assume.</w:t>
+              <w:t>Highlights the value of asking how a student learns rather than making assumptions.</w:t>
             </w:r>
           </w:p>
           <w:p>
@@ -323,7 +323,7 @@
                 <w:rFonts w:ascii="Manrope" w:hAnsi="Manrope"/>
                 <w:sz w:val="20"/>
               </w:rPr>
-              <w:t>Student voice strengthens collaboration between families and educators.</w:t>
+              <w:t>Supports stronger collaboration between families, students, and educators.</w:t>
             </w:r>
           </w:p>
         </w:tc>
@@ -350,11 +350,11 @@
         <w:tblLook w:val="04A0" w:firstRow="1" w:lastRow="0" w:firstColumn="1" w:lastColumn="0" w:noHBand="0" w:noVBand="1"/>
       </w:tblPr>
       <w:tblGrid>
-        <w:gridCol w:w="2448"/>
-        <w:gridCol w:w="1296"/>
-        <w:gridCol w:w="1296"/>
-        <w:gridCol w:w="3888"/>
-        <w:gridCol w:w="4176"/>
+        <w:gridCol w:w="2880"/>
+        <w:gridCol w:w="1440"/>
+        <w:gridCol w:w="1440"/>
+        <w:gridCol w:w="4320"/>
+        <w:gridCol w:w="5040"/>
       </w:tblGrid>
       <w:tr>
         <w:trPr>
@@ -362,7 +362,7 @@
         </w:trPr>
         <w:tc>
           <w:tcPr>
-            <w:tcW w:w="2448" w:type="dxa"/>
+            <w:tcW w:w="2880" w:type="dxa"/>
             <w:shd w:val="clear" w:color="auto" w:fill="E9DDF2"/>
           </w:tcPr>
           <w:p>
@@ -378,7 +378,7 @@
         </w:tc>
         <w:tc>
           <w:tcPr>
-            <w:tcW w:w="1296" w:type="dxa"/>
+            <w:tcW w:w="1440" w:type="dxa"/>
             <w:shd w:val="clear" w:color="auto" w:fill="E9DDF2"/>
           </w:tcPr>
           <w:p>
@@ -394,7 +394,7 @@
         </w:tc>
         <w:tc>
           <w:tcPr>
-            <w:tcW w:w="1296" w:type="dxa"/>
+            <w:tcW w:w="1440" w:type="dxa"/>
             <w:shd w:val="clear" w:color="auto" w:fill="E9DDF2"/>
           </w:tcPr>
           <w:p>
@@ -410,7 +410,7 @@
         </w:tc>
         <w:tc>
           <w:tcPr>
-            <w:tcW w:w="3888" w:type="dxa"/>
+            <w:tcW w:w="4320" w:type="dxa"/>
             <w:shd w:val="clear" w:color="auto" w:fill="E9DDF2"/>
           </w:tcPr>
           <w:p>
@@ -426,7 +426,7 @@
         </w:tc>
         <w:tc>
           <w:tcPr>
-            <w:tcW w:w="4176" w:type="dxa"/>
+            <w:tcW w:w="5040" w:type="dxa"/>
             <w:shd w:val="clear" w:color="auto" w:fill="E9DDF2"/>
           </w:tcPr>
           <w:p>
@@ -447,7 +447,7 @@
         </w:trPr>
         <w:tc>
           <w:tcPr>
-            <w:tcW w:w="2448" w:type="dxa"/>
+            <w:tcW w:w="2880" w:type="dxa"/>
           </w:tcPr>
           <w:p>
             <w:r>
@@ -461,7 +461,7 @@
         </w:tc>
         <w:tc>
           <w:tcPr>
-            <w:tcW w:w="1296" w:type="dxa"/>
+            <w:tcW w:w="1440" w:type="dxa"/>
           </w:tcPr>
           <w:p>
             <w:r>
@@ -475,7 +475,7 @@
         </w:tc>
         <w:tc>
           <w:tcPr>
-            <w:tcW w:w="1296" w:type="dxa"/>
+            <w:tcW w:w="1440" w:type="dxa"/>
           </w:tcPr>
           <w:p>
             <w:r>
@@ -489,7 +489,7 @@
         </w:tc>
         <w:tc>
           <w:tcPr>
-            <w:tcW w:w="3888" w:type="dxa"/>
+            <w:tcW w:w="4320" w:type="dxa"/>
           </w:tcPr>
           <w:p>
             <w:r>
@@ -503,7 +503,7 @@
         </w:tc>
         <w:tc>
           <w:tcPr>
-            <w:tcW w:w="4176" w:type="dxa"/>
+            <w:tcW w:w="5040" w:type="dxa"/>
           </w:tcPr>
           <w:p>
             <w:pPr>
@@ -514,7 +514,7 @@
                 <w:rFonts w:ascii="Manrope" w:hAnsi="Manrope"/>
                 <w:sz w:val="20"/>
               </w:rPr>
-              <w:t>A strengths-based lens moves attention away from deficit thinking.</w:t>
+              <w:t>Moves the conversation away from deficits and toward strengths.</w:t>
             </w:r>
           </w:p>
           <w:p>
@@ -526,7 +526,7 @@
                 <w:rFonts w:ascii="Manrope" w:hAnsi="Manrope"/>
                 <w:sz w:val="20"/>
               </w:rPr>
-              <w:t>Interests can support confidence, belonging, and learning.</w:t>
+              <w:t>Shows how interests can support confidence, belonging, and learning.</w:t>
             </w:r>
           </w:p>
           <w:p>
@@ -538,7 +538,7 @@
                 <w:rFonts w:ascii="Manrope" w:hAnsi="Manrope"/>
                 <w:sz w:val="20"/>
               </w:rPr>
-              <w:t>Strengths and interests vary across individuals and contexts.</w:t>
+              <w:t>Reinforces that strengths may look different across individuals and contexts.</w:t>
             </w:r>
           </w:p>
         </w:tc>
@@ -549,7 +549,7 @@
         </w:trPr>
         <w:tc>
           <w:tcPr>
-            <w:tcW w:w="2448" w:type="dxa"/>
+            <w:tcW w:w="2880" w:type="dxa"/>
           </w:tcPr>
           <w:p>
             <w:r>
@@ -563,7 +563,7 @@
         </w:tc>
         <w:tc>
           <w:tcPr>
-            <w:tcW w:w="1296" w:type="dxa"/>
+            <w:tcW w:w="1440" w:type="dxa"/>
           </w:tcPr>
           <w:p>
             <w:r>
@@ -577,7 +577,7 @@
         </w:tc>
         <w:tc>
           <w:tcPr>
-            <w:tcW w:w="1296" w:type="dxa"/>
+            <w:tcW w:w="1440" w:type="dxa"/>
           </w:tcPr>
           <w:p>
             <w:r>
@@ -591,7 +591,7 @@
         </w:tc>
         <w:tc>
           <w:tcPr>
-            <w:tcW w:w="3888" w:type="dxa"/>
+            <w:tcW w:w="4320" w:type="dxa"/>
           </w:tcPr>
           <w:p>
             <w:r>
@@ -605,7 +605,7 @@
         </w:tc>
         <w:tc>
           <w:tcPr>
-            <w:tcW w:w="4176" w:type="dxa"/>
+            <w:tcW w:w="5040" w:type="dxa"/>
           </w:tcPr>
           <w:p>
             <w:pPr>
@@ -616,7 +616,7 @@
                 <w:rFonts w:ascii="Manrope" w:hAnsi="Manrope"/>
                 <w:sz w:val="20"/>
               </w:rPr>
-              <w:t>Strengths and interests remain central in secondary school settings.</w:t>
+              <w:t>Connects strengths and interests to secondary school engagement.</w:t>
             </w:r>
           </w:p>
           <w:p>
@@ -628,7 +628,7 @@
                 <w:rFonts w:ascii="Manrope" w:hAnsi="Manrope"/>
                 <w:sz w:val="20"/>
               </w:rPr>
-              <w:t>Adolescent interests can be misunderstood if adults focus only on compliance.</w:t>
+              <w:t>Shows how interests can be misunderstood if adults focus only on compliance or curriculum.</w:t>
             </w:r>
           </w:p>
           <w:p>
@@ -640,7 +640,7 @@
                 <w:rFonts w:ascii="Manrope" w:hAnsi="Manrope"/>
                 <w:sz w:val="20"/>
               </w:rPr>
-              <w:t>A strengths-based response helps support engagement and identity.</w:t>
+              <w:t>Encourages a more respectful, strengths-based response to adolescent identity and motivation.</w:t>
             </w:r>
           </w:p>
         </w:tc>
@@ -651,7 +651,29 @@
         </w:trPr>
         <w:tc>
           <w:tcPr>
-            <w:tcW w:w="2448" w:type="dxa"/>
+            <w:tcW w:w="2880" w:type="dxa"/>
+          </w:tcPr>
+          <w:p>
+            <w:r>
+              <w:rPr>
+                <w:rFonts w:ascii="Manrope" w:hAnsi="Manrope"/>
+                <w:sz w:val="20"/>
+              </w:rPr>
+              <w:t xml:space="preserve">Connections to culture and </w:t>
+            </w:r>
+            <w:r>
+              <w:rPr>
+                <w:rFonts w:ascii="Manrope" w:hAnsi="Manrope"/>
+                <w:sz w:val="20"/>
+              </w:rPr>
+              <w:lastRenderedPageBreak/>
+              <w:t>community</w:t>
+            </w:r>
+          </w:p>
+        </w:tc>
+        <w:tc>
+          <w:tcPr>
+            <w:tcW w:w="1440" w:type="dxa"/>
           </w:tcPr>
           <w:p>
             <w:r>
@@ -660,27 +682,13 @@
                 <w:sz w:val="20"/>
               </w:rPr>
               <w:lastRenderedPageBreak/>
-              <w:t>Connections to culture and community</w:t>
-            </w:r>
-          </w:p>
-        </w:tc>
-        <w:tc>
-          <w:tcPr>
-            <w:tcW w:w="1296" w:type="dxa"/>
-          </w:tcPr>
-          <w:p>
-            <w:r>
-              <w:rPr>
-                <w:rFonts w:ascii="Manrope" w:hAnsi="Manrope"/>
-                <w:sz w:val="20"/>
-              </w:rPr>
               <w:t>17</w:t>
             </w:r>
           </w:p>
         </w:tc>
         <w:tc>
           <w:tcPr>
-            <w:tcW w:w="1296" w:type="dxa"/>
+            <w:tcW w:w="1440" w:type="dxa"/>
           </w:tcPr>
           <w:p>
             <w:r>
@@ -694,7 +702,7 @@
         </w:tc>
         <w:tc>
           <w:tcPr>
-            <w:tcW w:w="3888" w:type="dxa"/>
+            <w:tcW w:w="4320" w:type="dxa"/>
           </w:tcPr>
           <w:p>
             <w:r>
@@ -702,13 +710,21 @@
                 <w:rFonts w:ascii="Manrope" w:hAnsi="Manrope"/>
                 <w:sz w:val="20"/>
               </w:rPr>
-              <w:t>Hao shares how sport, music, dance, and community connections contribute to identity, belonging, and wellbeing.</w:t>
+              <w:t xml:space="preserve">Hao shares how sport, music, dance, and </w:t>
+            </w:r>
+            <w:r>
+              <w:rPr>
+                <w:rFonts w:ascii="Manrope" w:hAnsi="Manrope"/>
+                <w:sz w:val="20"/>
+              </w:rPr>
+              <w:lastRenderedPageBreak/>
+              <w:t>community connections contribute to identity, belonging, and wellbeing.</w:t>
             </w:r>
           </w:p>
         </w:tc>
         <w:tc>
           <w:tcPr>
-            <w:tcW w:w="4176" w:type="dxa"/>
+            <w:tcW w:w="5040" w:type="dxa"/>
           </w:tcPr>
           <w:p>
             <w:pPr>
@@ -719,7 +735,16 @@
                 <w:rFonts w:ascii="Manrope" w:hAnsi="Manrope"/>
                 <w:sz w:val="20"/>
               </w:rPr>
-              <w:t>Identity is shaped by culture, family, and community as well as disability.</w:t>
+              <w:lastRenderedPageBreak/>
+              <w:t xml:space="preserve">Emphasises that identity is shaped by more than </w:t>
+            </w:r>
+            <w:r>
+              <w:rPr>
+                <w:rFonts w:ascii="Manrope" w:hAnsi="Manrope"/>
+                <w:sz w:val="20"/>
+              </w:rPr>
+              <w:lastRenderedPageBreak/>
+              <w:t>disability or diagnosis.</w:t>
             </w:r>
           </w:p>
           <w:p>
@@ -731,7 +756,7 @@
                 <w:rFonts w:ascii="Manrope" w:hAnsi="Manrope"/>
                 <w:sz w:val="20"/>
               </w:rPr>
-              <w:t>Belonging and connection are important to wellbeing.</w:t>
+              <w:t>Highlights the importance of cultural, family, and community connections.</w:t>
             </w:r>
           </w:p>
           <w:p>
@@ -743,7 +768,7 @@
                 <w:rFonts w:ascii="Manrope" w:hAnsi="Manrope"/>
                 <w:sz w:val="20"/>
               </w:rPr>
-              <w:t>Support should reflect the whole person, not only diagnosis.</w:t>
+              <w:t>Encourages educators and families to notice the whole person, not just support needs.</w:t>
             </w:r>
           </w:p>
         </w:tc>
@@ -754,7 +779,7 @@
         </w:trPr>
         <w:tc>
           <w:tcPr>
-            <w:tcW w:w="2448" w:type="dxa"/>
+            <w:tcW w:w="2880" w:type="dxa"/>
           </w:tcPr>
           <w:p>
             <w:r>
@@ -762,13 +787,14 @@
                 <w:rFonts w:ascii="Manrope" w:hAnsi="Manrope"/>
                 <w:sz w:val="20"/>
               </w:rPr>
+              <w:lastRenderedPageBreak/>
               <w:t>Communication</w:t>
             </w:r>
           </w:p>
         </w:tc>
         <w:tc>
           <w:tcPr>
-            <w:tcW w:w="1296" w:type="dxa"/>
+            <w:tcW w:w="1440" w:type="dxa"/>
           </w:tcPr>
           <w:p>
             <w:r>
@@ -782,7 +808,7 @@
         </w:tc>
         <w:tc>
           <w:tcPr>
-            <w:tcW w:w="1296" w:type="dxa"/>
+            <w:tcW w:w="1440" w:type="dxa"/>
           </w:tcPr>
           <w:p>
             <w:r>
@@ -796,7 +822,7 @@
         </w:tc>
         <w:tc>
           <w:tcPr>
-            <w:tcW w:w="3888" w:type="dxa"/>
+            <w:tcW w:w="4320" w:type="dxa"/>
           </w:tcPr>
           <w:p>
             <w:r>
@@ -804,13 +830,13 @@
                 <w:rFonts w:ascii="Manrope" w:hAnsi="Manrope"/>
                 <w:sz w:val="20"/>
               </w:rPr>
-              <w:t>A montage of lived experience perspectives shows different ways autistic young people communicate, including speech, AAC, and non-traditional communication styles.</w:t>
+              <w:t>A montage of lived experience perspectives shows different ways autistic young people communicate, including speech, augmentative and alternative communication (AAC), and non-verbal or indirect communication styles.</w:t>
             </w:r>
           </w:p>
         </w:tc>
         <w:tc>
           <w:tcPr>
-            <w:tcW w:w="4176" w:type="dxa"/>
+            <w:tcW w:w="5040" w:type="dxa"/>
           </w:tcPr>
           <w:p>
             <w:pPr>
@@ -821,7 +847,7 @@
                 <w:rFonts w:ascii="Manrope" w:hAnsi="Manrope"/>
                 <w:sz w:val="20"/>
               </w:rPr>
-              <w:t>Communication is broader than spoken language.</w:t>
+              <w:t>Shows that communication is diverse and cannot be reduced to spoken language alone.</w:t>
             </w:r>
           </w:p>
           <w:p>
@@ -833,7 +859,7 @@
                 <w:rFonts w:ascii="Manrope" w:hAnsi="Manrope"/>
                 <w:sz w:val="20"/>
               </w:rPr>
-              <w:t>AAC and alternative communication methods are valid and important.</w:t>
+              <w:t>Introduces augmentative and alternative communication (AAC — tools and methods that support or replace speech, such as picture boards, speech-generating devices, or apps), processing differences, and misunderstandings in social interaction.</w:t>
             </w:r>
           </w:p>
           <w:p>
@@ -845,7 +871,7 @@
                 <w:rFonts w:ascii="Manrope" w:hAnsi="Manrope"/>
                 <w:sz w:val="20"/>
               </w:rPr>
-              <w:t>Respectful support requires flexibility and shared understanding.</w:t>
+              <w:t>Encourages communication support that is flexible, respectful, and collaborative.</w:t>
             </w:r>
           </w:p>
         </w:tc>
@@ -856,7 +882,7 @@
         </w:trPr>
         <w:tc>
           <w:tcPr>
-            <w:tcW w:w="2448" w:type="dxa"/>
+            <w:tcW w:w="2880" w:type="dxa"/>
           </w:tcPr>
           <w:p>
             <w:r>
@@ -870,7 +896,7 @@
         </w:tc>
         <w:tc>
           <w:tcPr>
-            <w:tcW w:w="1296" w:type="dxa"/>
+            <w:tcW w:w="1440" w:type="dxa"/>
           </w:tcPr>
           <w:p>
             <w:r>
@@ -884,7 +910,7 @@
         </w:tc>
         <w:tc>
           <w:tcPr>
-            <w:tcW w:w="1296" w:type="dxa"/>
+            <w:tcW w:w="1440" w:type="dxa"/>
           </w:tcPr>
           <w:p>
             <w:r>
@@ -898,7 +924,7 @@
         </w:tc>
         <w:tc>
           <w:tcPr>
-            <w:tcW w:w="3888" w:type="dxa"/>
+            <w:tcW w:w="4320" w:type="dxa"/>
           </w:tcPr>
           <w:p>
             <w:r>
@@ -912,7 +938,7 @@
         </w:tc>
         <w:tc>
           <w:tcPr>
-            <w:tcW w:w="4176" w:type="dxa"/>
+            <w:tcW w:w="5040" w:type="dxa"/>
           </w:tcPr>
           <w:p>
             <w:pPr>
@@ -923,7 +949,7 @@
                 <w:rFonts w:ascii="Manrope" w:hAnsi="Manrope"/>
                 <w:sz w:val="20"/>
               </w:rPr>
-              <w:t>Executive functioning includes planning, organisation, memory, and self-management.</w:t>
+              <w:t>Defines executive functioning in practical, everyday terms.</w:t>
             </w:r>
           </w:p>
           <w:p>
@@ -935,7 +961,7 @@
                 <w:rFonts w:ascii="Manrope" w:hAnsi="Manrope"/>
                 <w:sz w:val="20"/>
               </w:rPr>
-              <w:t>These processes affect participation in everyday tasks.</w:t>
+              <w:t>Links executive functioning to organisation, planning, memory, and self-management.</w:t>
             </w:r>
           </w:p>
           <w:p>
@@ -947,7 +973,7 @@
                 <w:rFonts w:ascii="Manrope" w:hAnsi="Manrope"/>
                 <w:sz w:val="20"/>
               </w:rPr>
-              <w:t>Challenges may be cognitive and invisible rather than behavioural.</w:t>
+              <w:t>Helps participants recognise that these processes can affect participation across school and home life.</w:t>
             </w:r>
           </w:p>
         </w:tc>
@@ -958,7 +984,7 @@
         </w:trPr>
         <w:tc>
           <w:tcPr>
-            <w:tcW w:w="2448" w:type="dxa"/>
+            <w:tcW w:w="2880" w:type="dxa"/>
           </w:tcPr>
           <w:p>
             <w:r>
@@ -972,7 +998,7 @@
         </w:tc>
         <w:tc>
           <w:tcPr>
-            <w:tcW w:w="1296" w:type="dxa"/>
+            <w:tcW w:w="1440" w:type="dxa"/>
           </w:tcPr>
           <w:p>
             <w:r>
@@ -986,7 +1012,7 @@
         </w:tc>
         <w:tc>
           <w:tcPr>
-            <w:tcW w:w="1296" w:type="dxa"/>
+            <w:tcW w:w="1440" w:type="dxa"/>
           </w:tcPr>
           <w:p>
             <w:r>
@@ -1000,7 +1026,7 @@
         </w:tc>
         <w:tc>
           <w:tcPr>
-            <w:tcW w:w="3888" w:type="dxa"/>
+            <w:tcW w:w="4320" w:type="dxa"/>
           </w:tcPr>
           <w:p>
             <w:r>
@@ -1014,7 +1040,7 @@
         </w:tc>
         <w:tc>
           <w:tcPr>
-            <w:tcW w:w="4176" w:type="dxa"/>
+            <w:tcW w:w="5040" w:type="dxa"/>
           </w:tcPr>
           <w:p>
             <w:pPr>
@@ -1025,7 +1051,7 @@
                 <w:rFonts w:ascii="Manrope" w:hAnsi="Manrope"/>
                 <w:sz w:val="20"/>
               </w:rPr>
-              <w:t>Lived experience adds depth to the concept of executive functioning.</w:t>
+              <w:t>Adds a personal perspective to the concept of executive functioning.</w:t>
             </w:r>
           </w:p>
           <w:p>
@@ -1037,7 +1063,7 @@
                 <w:rFonts w:ascii="Manrope" w:hAnsi="Manrope"/>
                 <w:sz w:val="20"/>
               </w:rPr>
-              <w:t>Everyday demands may feel much heavier than they appear from the outside.</w:t>
+              <w:t>Shows how invisible cognitive demands can shape everyday experiences.</w:t>
             </w:r>
           </w:p>
           <w:p>
@@ -1049,7 +1075,7 @@
                 <w:rFonts w:ascii="Manrope" w:hAnsi="Manrope"/>
                 <w:sz w:val="20"/>
               </w:rPr>
-              <w:t>Empathy is needed when behaviour is shaped by hidden cognitive load.</w:t>
+              <w:t>Encourages empathy for behaviours that may otherwise be misread as unwillingness or defiance.</w:t>
             </w:r>
           </w:p>
         </w:tc>
@@ -1060,7 +1086,7 @@
         </w:trPr>
         <w:tc>
           <w:tcPr>
-            <w:tcW w:w="2448" w:type="dxa"/>
+            <w:tcW w:w="2880" w:type="dxa"/>
           </w:tcPr>
           <w:p>
             <w:r>
@@ -1074,7 +1100,7 @@
         </w:tc>
         <w:tc>
           <w:tcPr>
-            <w:tcW w:w="1296" w:type="dxa"/>
+            <w:tcW w:w="1440" w:type="dxa"/>
           </w:tcPr>
           <w:p>
             <w:r>
@@ -1088,7 +1114,7 @@
         </w:tc>
         <w:tc>
           <w:tcPr>
-            <w:tcW w:w="1296" w:type="dxa"/>
+            <w:tcW w:w="1440" w:type="dxa"/>
           </w:tcPr>
           <w:p>
             <w:r>
@@ -1102,7 +1128,7 @@
         </w:tc>
         <w:tc>
           <w:tcPr>
-            <w:tcW w:w="3888" w:type="dxa"/>
+            <w:tcW w:w="4320" w:type="dxa"/>
           </w:tcPr>
           <w:p>
             <w:r>
@@ -1116,7 +1142,7 @@
         </w:tc>
         <w:tc>
           <w:tcPr>
-            <w:tcW w:w="4176" w:type="dxa"/>
+            <w:tcW w:w="5040" w:type="dxa"/>
           </w:tcPr>
           <w:p>
             <w:pPr>
@@ -1127,7 +1153,7 @@
                 <w:rFonts w:ascii="Manrope" w:hAnsi="Manrope"/>
                 <w:sz w:val="20"/>
               </w:rPr>
-              <w:t>Independence often depends on planning, sequencing, and support.</w:t>
+              <w:t>Shows that everyday independence often requires planning, sequencing, and support.</w:t>
             </w:r>
           </w:p>
           <w:p>
@@ -1139,7 +1165,7 @@
                 <w:rFonts w:ascii="Manrope" w:hAnsi="Manrope"/>
                 <w:sz w:val="20"/>
               </w:rPr>
-              <w:t>Everyday self-care can involve significant unseen effort.</w:t>
+              <w:t>Highlights how self-care expectations can be stressful or uneven across contexts.</w:t>
             </w:r>
           </w:p>
           <w:p>
@@ -1151,7 +1177,7 @@
                 <w:rFonts w:ascii="Manrope" w:hAnsi="Manrope"/>
                 <w:sz w:val="20"/>
               </w:rPr>
-              <w:t>Support should be realistic, individualised, and respectful.</w:t>
+              <w:t>Encourages realistic and individualised support rather than assumptions about capability.</w:t>
             </w:r>
           </w:p>
         </w:tc>
@@ -1162,7 +1188,7 @@
         </w:trPr>
         <w:tc>
           <w:tcPr>
-            <w:tcW w:w="2448" w:type="dxa"/>
+            <w:tcW w:w="2880" w:type="dxa"/>
           </w:tcPr>
           <w:p>
             <w:r>
@@ -1176,7 +1202,7 @@
         </w:tc>
         <w:tc>
           <w:tcPr>
-            <w:tcW w:w="1296" w:type="dxa"/>
+            <w:tcW w:w="1440" w:type="dxa"/>
           </w:tcPr>
           <w:p>
             <w:r>
@@ -1190,7 +1216,7 @@
         </w:tc>
         <w:tc>
           <w:tcPr>
-            <w:tcW w:w="1296" w:type="dxa"/>
+            <w:tcW w:w="1440" w:type="dxa"/>
           </w:tcPr>
           <w:p>
             <w:r>
@@ -1204,7 +1230,7 @@
         </w:tc>
         <w:tc>
           <w:tcPr>
-            <w:tcW w:w="3888" w:type="dxa"/>
+            <w:tcW w:w="4320" w:type="dxa"/>
           </w:tcPr>
           <w:p>
             <w:r>
@@ -1212,13 +1238,13 @@
                 <w:rFonts w:ascii="Manrope" w:hAnsi="Manrope"/>
                 <w:sz w:val="20"/>
               </w:rPr>
-              <w:t>Autistic young people describe strategies and supports that help them participate, regulate, communicate, and manage day-to-day life.</w:t>
+              <w:t>Autistic young people describe strategies and supports that help them participate, self-regulate (manage their emotions and responses), communicate, and manage day-to-day life.</w:t>
             </w:r>
           </w:p>
         </w:tc>
         <w:tc>
           <w:tcPr>
-            <w:tcW w:w="4176" w:type="dxa"/>
+            <w:tcW w:w="5040" w:type="dxa"/>
           </w:tcPr>
           <w:p>
             <w:pPr>
@@ -1229,7 +1255,7 @@
                 <w:rFonts w:ascii="Manrope" w:hAnsi="Manrope"/>
                 <w:sz w:val="20"/>
               </w:rPr>
-              <w:t>Useful strategies are practical and individualised.</w:t>
+              <w:t>Provides concrete examples of supports that make a positive difference.</w:t>
             </w:r>
           </w:p>
           <w:p>
@@ -1241,7 +1267,7 @@
                 <w:rFonts w:ascii="Manrope" w:hAnsi="Manrope"/>
                 <w:sz w:val="20"/>
               </w:rPr>
-              <w:t>Supports should be matched to the person and context.</w:t>
+              <w:t>Shows that useful strategies are individual and context-dependent.</w:t>
             </w:r>
           </w:p>
           <w:p>
@@ -1253,23 +1279,13 @@
                 <w:rFonts w:ascii="Manrope" w:hAnsi="Manrope"/>
                 <w:sz w:val="20"/>
               </w:rPr>
-              <w:t>Strategies can improve participation, regulation, and communication.</w:t>
+              <w:t>Encourages participants to match strategies to the person rather than apply the same approach to everyone.</w:t>
             </w:r>
           </w:p>
         </w:tc>
       </w:tr>
     </w:tbl>
     <w:p/>
-    <w:p>
-      <w:pPr>
-        <w:rPr>
-          <w:rFonts w:ascii="Fraunces" w:hAnsi="Fraunces"/>
-          <w:b/>
-          <w:color w:val="712D90"/>
-          <w:sz w:val="30"/>
-        </w:rPr>
-      </w:pPr>
-    </w:p>
     <w:p>
       <w:r>
         <w:rPr>
@@ -1278,7 +1294,6 @@
           <w:color w:val="712D90"/>
           <w:sz w:val="30"/>
         </w:rPr>
-        <w:lastRenderedPageBreak/>
         <w:t>Session 3: Sensory Processing</w:t>
       </w:r>
     </w:p>
@@ -1291,11 +1306,11 @@
         <w:tblLook w:val="04A0" w:firstRow="1" w:lastRow="0" w:firstColumn="1" w:lastColumn="0" w:noHBand="0" w:noVBand="1"/>
       </w:tblPr>
       <w:tblGrid>
-        <w:gridCol w:w="2448"/>
-        <w:gridCol w:w="1296"/>
-        <w:gridCol w:w="1296"/>
-        <w:gridCol w:w="3888"/>
-        <w:gridCol w:w="4176"/>
+        <w:gridCol w:w="2880"/>
+        <w:gridCol w:w="1440"/>
+        <w:gridCol w:w="1440"/>
+        <w:gridCol w:w="4320"/>
+        <w:gridCol w:w="5040"/>
       </w:tblGrid>
       <w:tr>
         <w:trPr>
@@ -1303,7 +1318,7 @@
         </w:trPr>
         <w:tc>
           <w:tcPr>
-            <w:tcW w:w="2448" w:type="dxa"/>
+            <w:tcW w:w="2880" w:type="dxa"/>
             <w:shd w:val="clear" w:color="auto" w:fill="E9DDF2"/>
           </w:tcPr>
           <w:p>
@@ -1319,7 +1334,7 @@
         </w:tc>
         <w:tc>
           <w:tcPr>
-            <w:tcW w:w="1296" w:type="dxa"/>
+            <w:tcW w:w="1440" w:type="dxa"/>
             <w:shd w:val="clear" w:color="auto" w:fill="E9DDF2"/>
           </w:tcPr>
           <w:p>
@@ -1335,7 +1350,7 @@
         </w:tc>
         <w:tc>
           <w:tcPr>
-            <w:tcW w:w="1296" w:type="dxa"/>
+            <w:tcW w:w="1440" w:type="dxa"/>
             <w:shd w:val="clear" w:color="auto" w:fill="E9DDF2"/>
           </w:tcPr>
           <w:p>
@@ -1351,7 +1366,7 @@
         </w:tc>
         <w:tc>
           <w:tcPr>
-            <w:tcW w:w="3888" w:type="dxa"/>
+            <w:tcW w:w="4320" w:type="dxa"/>
             <w:shd w:val="clear" w:color="auto" w:fill="E9DDF2"/>
           </w:tcPr>
           <w:p>
@@ -1367,7 +1382,7 @@
         </w:tc>
         <w:tc>
           <w:tcPr>
-            <w:tcW w:w="4176" w:type="dxa"/>
+            <w:tcW w:w="5040" w:type="dxa"/>
             <w:shd w:val="clear" w:color="auto" w:fill="E9DDF2"/>
           </w:tcPr>
           <w:p>
@@ -1388,7 +1403,7 @@
         </w:trPr>
         <w:tc>
           <w:tcPr>
-            <w:tcW w:w="2448" w:type="dxa"/>
+            <w:tcW w:w="2880" w:type="dxa"/>
           </w:tcPr>
           <w:p>
             <w:r>
@@ -1402,7 +1417,7 @@
         </w:tc>
         <w:tc>
           <w:tcPr>
-            <w:tcW w:w="1296" w:type="dxa"/>
+            <w:tcW w:w="1440" w:type="dxa"/>
           </w:tcPr>
           <w:p>
             <w:r>
@@ -1416,7 +1431,7 @@
         </w:tc>
         <w:tc>
           <w:tcPr>
-            <w:tcW w:w="1296" w:type="dxa"/>
+            <w:tcW w:w="1440" w:type="dxa"/>
           </w:tcPr>
           <w:p>
             <w:r>
@@ -1430,7 +1445,7 @@
         </w:tc>
         <w:tc>
           <w:tcPr>
-            <w:tcW w:w="3888" w:type="dxa"/>
+            <w:tcW w:w="4320" w:type="dxa"/>
           </w:tcPr>
           <w:p>
             <w:r>
@@ -1444,7 +1459,7 @@
         </w:tc>
         <w:tc>
           <w:tcPr>
-            <w:tcW w:w="4176" w:type="dxa"/>
+            <w:tcW w:w="5040" w:type="dxa"/>
           </w:tcPr>
           <w:p>
             <w:pPr>
@@ -1455,7 +1470,7 @@
                 <w:rFonts w:ascii="Manrope" w:hAnsi="Manrope"/>
                 <w:sz w:val="20"/>
               </w:rPr>
-              <w:t>Sensory experience can be heightened, layered, and highly individual.</w:t>
+              <w:t>Introduces sensory processing through lived experience rather than theory alone.</w:t>
             </w:r>
           </w:p>
           <w:p>
@@ -1467,7 +1482,7 @@
                 <w:rFonts w:ascii="Manrope" w:hAnsi="Manrope"/>
                 <w:sz w:val="20"/>
               </w:rPr>
-              <w:t>Ordinary environments may feel very different to autistic people.</w:t>
+              <w:t>Shows that sensory experiences can be heightened, layered, and deeply personal.</w:t>
             </w:r>
           </w:p>
           <w:p>
@@ -1479,7 +1494,7 @@
                 <w:rFonts w:ascii="Manrope" w:hAnsi="Manrope"/>
                 <w:sz w:val="20"/>
               </w:rPr>
-              <w:t>Lived sensory perspectives help build empathy.</w:t>
+              <w:t>Builds empathy for how ordinary settings may feel very different to autistic people.</w:t>
             </w:r>
           </w:p>
         </w:tc>
@@ -1490,7 +1505,7 @@
         </w:trPr>
         <w:tc>
           <w:tcPr>
-            <w:tcW w:w="2448" w:type="dxa"/>
+            <w:tcW w:w="2880" w:type="dxa"/>
           </w:tcPr>
           <w:p>
             <w:r>
@@ -1504,7 +1519,7 @@
         </w:tc>
         <w:tc>
           <w:tcPr>
-            <w:tcW w:w="1296" w:type="dxa"/>
+            <w:tcW w:w="1440" w:type="dxa"/>
           </w:tcPr>
           <w:p>
             <w:r>
@@ -1518,7 +1533,7 @@
         </w:tc>
         <w:tc>
           <w:tcPr>
-            <w:tcW w:w="1296" w:type="dxa"/>
+            <w:tcW w:w="1440" w:type="dxa"/>
           </w:tcPr>
           <w:p>
             <w:r>
@@ -1532,7 +1547,7 @@
         </w:tc>
         <w:tc>
           <w:tcPr>
-            <w:tcW w:w="3888" w:type="dxa"/>
+            <w:tcW w:w="4320" w:type="dxa"/>
           </w:tcPr>
           <w:p>
             <w:r>
@@ -1546,7 +1561,7 @@
         </w:tc>
         <w:tc>
           <w:tcPr>
-            <w:tcW w:w="4176" w:type="dxa"/>
+            <w:tcW w:w="5040" w:type="dxa"/>
           </w:tcPr>
           <w:p>
             <w:pPr>
@@ -1557,7 +1572,7 @@
                 <w:rFonts w:ascii="Manrope" w:hAnsi="Manrope"/>
                 <w:sz w:val="20"/>
               </w:rPr>
-              <w:t>Sensory processing is a central part of lived experience.</w:t>
+              <w:t>Frames sensory processing as a central part of lived experience, not a side issue.</w:t>
             </w:r>
           </w:p>
           <w:p>
@@ -1569,7 +1584,7 @@
                 <w:rFonts w:ascii="Manrope" w:hAnsi="Manrope"/>
                 <w:sz w:val="20"/>
               </w:rPr>
-              <w:t>Responses to sound, light, touch, or movement can vary widely.</w:t>
+              <w:t>Helps participants understand why responses to sound, light, movement, or touch can vary widely.</w:t>
             </w:r>
           </w:p>
           <w:p>
@@ -1581,7 +1596,7 @@
                 <w:rFonts w:ascii="Manrope" w:hAnsi="Manrope"/>
                 <w:sz w:val="20"/>
               </w:rPr>
-              <w:t>Behaviour linked to sensory need should be interpreted respectfully.</w:t>
+              <w:t>Supports a more respectful interpretation of behaviour linked to sensory need.</w:t>
             </w:r>
           </w:p>
         </w:tc>
@@ -1592,7 +1607,7 @@
         </w:trPr>
         <w:tc>
           <w:tcPr>
-            <w:tcW w:w="2448" w:type="dxa"/>
+            <w:tcW w:w="2880" w:type="dxa"/>
           </w:tcPr>
           <w:p>
             <w:r>
@@ -1606,7 +1621,7 @@
         </w:tc>
         <w:tc>
           <w:tcPr>
-            <w:tcW w:w="1296" w:type="dxa"/>
+            <w:tcW w:w="1440" w:type="dxa"/>
           </w:tcPr>
           <w:p>
             <w:r>
@@ -1620,7 +1635,7 @@
         </w:tc>
         <w:tc>
           <w:tcPr>
-            <w:tcW w:w="1296" w:type="dxa"/>
+            <w:tcW w:w="1440" w:type="dxa"/>
           </w:tcPr>
           <w:p>
             <w:r>
@@ -1634,7 +1649,7 @@
         </w:tc>
         <w:tc>
           <w:tcPr>
-            <w:tcW w:w="3888" w:type="dxa"/>
+            <w:tcW w:w="4320" w:type="dxa"/>
           </w:tcPr>
           <w:p>
             <w:r>
@@ -1648,7 +1663,7 @@
         </w:tc>
         <w:tc>
           <w:tcPr>
-            <w:tcW w:w="4176" w:type="dxa"/>
+            <w:tcW w:w="5040" w:type="dxa"/>
           </w:tcPr>
           <w:p>
             <w:pPr>
@@ -1659,7 +1674,7 @@
                 <w:rFonts w:ascii="Manrope" w:hAnsi="Manrope"/>
                 <w:sz w:val="20"/>
               </w:rPr>
-              <w:t>Sensory profiles are not all the same.</w:t>
+              <w:t>Introduces the idea that sensory profiles are not all the same.</w:t>
             </w:r>
           </w:p>
           <w:p>
@@ -1671,7 +1686,7 @@
                 <w:rFonts w:ascii="Manrope" w:hAnsi="Manrope"/>
                 <w:sz w:val="20"/>
               </w:rPr>
-              <w:t>Sensitivity can differ across senses and situations.</w:t>
+              <w:t>Explains that sensitivity can shift across senses and situations.</w:t>
             </w:r>
           </w:p>
           <w:p>
@@ -1683,7 +1698,7 @@
                 <w:rFonts w:ascii="Manrope" w:hAnsi="Manrope"/>
                 <w:sz w:val="20"/>
               </w:rPr>
-              <w:t>A simple analogy helps explain how overload can happen.</w:t>
+              <w:t>Helps participants move beyond simplistic ideas about sensory behaviour.</w:t>
             </w:r>
           </w:p>
         </w:tc>
@@ -1694,7 +1709,7 @@
         </w:trPr>
         <w:tc>
           <w:tcPr>
-            <w:tcW w:w="2448" w:type="dxa"/>
+            <w:tcW w:w="2880" w:type="dxa"/>
           </w:tcPr>
           <w:p>
             <w:r>
@@ -1708,7 +1723,7 @@
         </w:tc>
         <w:tc>
           <w:tcPr>
-            <w:tcW w:w="1296" w:type="dxa"/>
+            <w:tcW w:w="1440" w:type="dxa"/>
           </w:tcPr>
           <w:p>
             <w:r>
@@ -1722,7 +1737,7 @@
         </w:tc>
         <w:tc>
           <w:tcPr>
-            <w:tcW w:w="1296" w:type="dxa"/>
+            <w:tcW w:w="1440" w:type="dxa"/>
           </w:tcPr>
           <w:p>
             <w:r>
@@ -1736,7 +1751,7 @@
         </w:tc>
         <w:tc>
           <w:tcPr>
-            <w:tcW w:w="3888" w:type="dxa"/>
+            <w:tcW w:w="4320" w:type="dxa"/>
           </w:tcPr>
           <w:p>
             <w:r>
@@ -1750,7 +1765,7 @@
         </w:tc>
         <w:tc>
           <w:tcPr>
-            <w:tcW w:w="4176" w:type="dxa"/>
+            <w:tcW w:w="5040" w:type="dxa"/>
           </w:tcPr>
           <w:p>
             <w:pPr>
@@ -1761,7 +1776,7 @@
                 <w:rFonts w:ascii="Manrope" w:hAnsi="Manrope"/>
                 <w:sz w:val="20"/>
               </w:rPr>
-              <w:t>Sensory processing is shaped by context as well as the individual.</w:t>
+              <w:t>Emphasises that sensory processing is shaped by context, not just by the individual.</w:t>
             </w:r>
           </w:p>
           <w:p>
@@ -1773,7 +1788,7 @@
                 <w:rFonts w:ascii="Manrope" w:hAnsi="Manrope"/>
                 <w:sz w:val="20"/>
               </w:rPr>
-              <w:t>Stress, environment, and demand levels can change tolerance.</w:t>
+              <w:t>Shows how environment, stress, and demands can change sensory tolerance.</w:t>
             </w:r>
           </w:p>
           <w:p>
@@ -1785,7 +1800,7 @@
                 <w:rFonts w:ascii="Manrope" w:hAnsi="Manrope"/>
                 <w:sz w:val="20"/>
               </w:rPr>
-              <w:t>Adjustments to spaces and routines can make a meaningful difference.</w:t>
+              <w:t>Encourages more thoughtful adjustment of spaces, routines, and expectations.</w:t>
             </w:r>
           </w:p>
         </w:tc>
@@ -1796,7 +1811,7 @@
         </w:trPr>
         <w:tc>
           <w:tcPr>
-            <w:tcW w:w="2448" w:type="dxa"/>
+            <w:tcW w:w="2880" w:type="dxa"/>
           </w:tcPr>
           <w:p>
             <w:r>
@@ -1810,7 +1825,7 @@
         </w:tc>
         <w:tc>
           <w:tcPr>
-            <w:tcW w:w="1296" w:type="dxa"/>
+            <w:tcW w:w="1440" w:type="dxa"/>
           </w:tcPr>
           <w:p>
             <w:r>
@@ -1824,7 +1839,7 @@
         </w:tc>
         <w:tc>
           <w:tcPr>
-            <w:tcW w:w="1296" w:type="dxa"/>
+            <w:tcW w:w="1440" w:type="dxa"/>
           </w:tcPr>
           <w:p>
             <w:r>
@@ -1838,7 +1853,7 @@
         </w:tc>
         <w:tc>
           <w:tcPr>
-            <w:tcW w:w="3888" w:type="dxa"/>
+            <w:tcW w:w="4320" w:type="dxa"/>
           </w:tcPr>
           <w:p>
             <w:r>
@@ -1852,7 +1867,7 @@
         </w:tc>
         <w:tc>
           <w:tcPr>
-            <w:tcW w:w="4176" w:type="dxa"/>
+            <w:tcW w:w="5040" w:type="dxa"/>
           </w:tcPr>
           <w:p>
             <w:pPr>
@@ -1863,7 +1878,7 @@
                 <w:rFonts w:ascii="Manrope" w:hAnsi="Manrope"/>
                 <w:sz w:val="20"/>
               </w:rPr>
-              <w:t>Sensory support should focus on practical adjustment, not forced coping.</w:t>
+              <w:t>Focuses on practical supports rather than expecting the person to simply cope.</w:t>
             </w:r>
           </w:p>
           <w:p>
@@ -1875,7 +1890,7 @@
                 <w:rFonts w:ascii="Manrope" w:hAnsi="Manrope"/>
                 <w:sz w:val="20"/>
               </w:rPr>
-              <w:t>Strategies should be collaborative and individualised.</w:t>
+              <w:t>Highlights that sensory strategies should be collaborative and individualised.</w:t>
             </w:r>
           </w:p>
           <w:p>
@@ -1887,23 +1902,13 @@
                 <w:rFonts w:ascii="Manrope" w:hAnsi="Manrope"/>
                 <w:sz w:val="20"/>
               </w:rPr>
-              <w:t>Thoughtful adjustments improve access, comfort, and participation.</w:t>
+              <w:t>Connects adjustments to access, comfort, regulation, and participation.</w:t>
             </w:r>
           </w:p>
         </w:tc>
       </w:tr>
     </w:tbl>
     <w:p/>
-    <w:p>
-      <w:pPr>
-        <w:rPr>
-          <w:rFonts w:ascii="Fraunces" w:hAnsi="Fraunces"/>
-          <w:b/>
-          <w:color w:val="712D90"/>
-          <w:sz w:val="30"/>
-        </w:rPr>
-      </w:pPr>
-    </w:p>
     <w:p>
       <w:pPr>
         <w:rPr>
@@ -1935,11 +1940,11 @@
         <w:tblLook w:val="04A0" w:firstRow="1" w:lastRow="0" w:firstColumn="1" w:lastColumn="0" w:noHBand="0" w:noVBand="1"/>
       </w:tblPr>
       <w:tblGrid>
-        <w:gridCol w:w="2448"/>
-        <w:gridCol w:w="1296"/>
-        <w:gridCol w:w="1296"/>
-        <w:gridCol w:w="3888"/>
-        <w:gridCol w:w="4176"/>
+        <w:gridCol w:w="2880"/>
+        <w:gridCol w:w="1440"/>
+        <w:gridCol w:w="1440"/>
+        <w:gridCol w:w="4320"/>
+        <w:gridCol w:w="5040"/>
       </w:tblGrid>
       <w:tr>
         <w:trPr>
@@ -1947,7 +1952,7 @@
         </w:trPr>
         <w:tc>
           <w:tcPr>
-            <w:tcW w:w="2448" w:type="dxa"/>
+            <w:tcW w:w="2880" w:type="dxa"/>
             <w:shd w:val="clear" w:color="auto" w:fill="E9DDF2"/>
           </w:tcPr>
           <w:p>
@@ -1963,7 +1968,7 @@
         </w:tc>
         <w:tc>
           <w:tcPr>
-            <w:tcW w:w="1296" w:type="dxa"/>
+            <w:tcW w:w="1440" w:type="dxa"/>
             <w:shd w:val="clear" w:color="auto" w:fill="E9DDF2"/>
           </w:tcPr>
           <w:p>
@@ -1979,7 +1984,7 @@
         </w:tc>
         <w:tc>
           <w:tcPr>
-            <w:tcW w:w="1296" w:type="dxa"/>
+            <w:tcW w:w="1440" w:type="dxa"/>
             <w:shd w:val="clear" w:color="auto" w:fill="E9DDF2"/>
           </w:tcPr>
           <w:p>
@@ -1995,7 +2000,7 @@
         </w:tc>
         <w:tc>
           <w:tcPr>
-            <w:tcW w:w="3888" w:type="dxa"/>
+            <w:tcW w:w="4320" w:type="dxa"/>
             <w:shd w:val="clear" w:color="auto" w:fill="E9DDF2"/>
           </w:tcPr>
           <w:p>
@@ -2011,7 +2016,7 @@
         </w:tc>
         <w:tc>
           <w:tcPr>
-            <w:tcW w:w="4176" w:type="dxa"/>
+            <w:tcW w:w="5040" w:type="dxa"/>
             <w:shd w:val="clear" w:color="auto" w:fill="E9DDF2"/>
           </w:tcPr>
           <w:p>
@@ -2032,7 +2037,7 @@
         </w:trPr>
         <w:tc>
           <w:tcPr>
-            <w:tcW w:w="2448" w:type="dxa"/>
+            <w:tcW w:w="2880" w:type="dxa"/>
           </w:tcPr>
           <w:p>
             <w:r>
@@ -2046,7 +2051,7 @@
         </w:tc>
         <w:tc>
           <w:tcPr>
-            <w:tcW w:w="1296" w:type="dxa"/>
+            <w:tcW w:w="1440" w:type="dxa"/>
           </w:tcPr>
           <w:p>
             <w:r>
@@ -2060,7 +2065,7 @@
         </w:tc>
         <w:tc>
           <w:tcPr>
-            <w:tcW w:w="1296" w:type="dxa"/>
+            <w:tcW w:w="1440" w:type="dxa"/>
           </w:tcPr>
           <w:p>
             <w:r>
@@ -2074,7 +2079,7 @@
         </w:tc>
         <w:tc>
           <w:tcPr>
-            <w:tcW w:w="3888" w:type="dxa"/>
+            <w:tcW w:w="4320" w:type="dxa"/>
           </w:tcPr>
           <w:p>
             <w:r>
@@ -2082,13 +2087,13 @@
                 <w:rFonts w:ascii="Manrope" w:hAnsi="Manrope"/>
                 <w:sz w:val="20"/>
               </w:rPr>
-              <w:t>This short explainer introduces the legal obligations schools have under the Disability Standards for Education and why they matter in practice.</w:t>
+              <w:t>This short explainer introduces the legal obligations schools have under the Disability Standards for Education (DSE, 2005) and why they matter in practice.</w:t>
             </w:r>
           </w:p>
         </w:tc>
         <w:tc>
           <w:tcPr>
-            <w:tcW w:w="4176" w:type="dxa"/>
+            <w:tcW w:w="5040" w:type="dxa"/>
           </w:tcPr>
           <w:p>
             <w:pPr>
@@ -2099,7 +2104,7 @@
                 <w:rFonts w:ascii="Manrope" w:hAnsi="Manrope"/>
                 <w:sz w:val="20"/>
               </w:rPr>
-              <w:t>The Standards create legal responsibilities, not optional supports.</w:t>
+              <w:t>Explains that the Standards are legal responsibilities, not optional supports.</w:t>
             </w:r>
           </w:p>
           <w:p>
@@ -2111,7 +2116,7 @@
                 <w:rFonts w:ascii="Manrope" w:hAnsi="Manrope"/>
                 <w:sz w:val="20"/>
               </w:rPr>
-              <w:t>Consultation and reasonable adjustments are central obligations.</w:t>
+              <w:t>Highlights consultation, reasonable adjustments (changes schools must make to give students with disability fair access to education), and protection from discrimination.</w:t>
             </w:r>
           </w:p>
           <w:p>
@@ -2123,7 +2128,7 @@
                 <w:rFonts w:ascii="Manrope" w:hAnsi="Manrope"/>
                 <w:sz w:val="20"/>
               </w:rPr>
-              <w:t>The framework helps explain rights and responsibilities in education.</w:t>
+              <w:t>Provides a practical starting point for understanding rights and responsibilities in education.</w:t>
             </w:r>
           </w:p>
         </w:tc>
@@ -2134,7 +2139,7 @@
         </w:trPr>
         <w:tc>
           <w:tcPr>
-            <w:tcW w:w="2448" w:type="dxa"/>
+            <w:tcW w:w="2880" w:type="dxa"/>
           </w:tcPr>
           <w:p>
             <w:r>
@@ -2148,7 +2153,7 @@
         </w:tc>
         <w:tc>
           <w:tcPr>
-            <w:tcW w:w="1296" w:type="dxa"/>
+            <w:tcW w:w="1440" w:type="dxa"/>
           </w:tcPr>
           <w:p>
             <w:r>
@@ -2162,7 +2167,7 @@
         </w:tc>
         <w:tc>
           <w:tcPr>
-            <w:tcW w:w="1296" w:type="dxa"/>
+            <w:tcW w:w="1440" w:type="dxa"/>
           </w:tcPr>
           <w:p>
             <w:r>
@@ -2176,7 +2181,7 @@
         </w:tc>
         <w:tc>
           <w:tcPr>
-            <w:tcW w:w="3888" w:type="dxa"/>
+            <w:tcW w:w="4320" w:type="dxa"/>
           </w:tcPr>
           <w:p>
             <w:r>
@@ -2184,13 +2189,13 @@
                 <w:rFonts w:ascii="Manrope" w:hAnsi="Manrope"/>
                 <w:sz w:val="20"/>
               </w:rPr>
-              <w:t>A family-school clip closes the session by focusing on practical partnership, shared goals, and what effective collaboration can look like going forward.</w:t>
+              <w:t>A family and school team close the session by reflecting on what genuine collaboration looks like in practice — shared goals, open communication, and a continued focus on the young person.</w:t>
             </w:r>
           </w:p>
         </w:tc>
         <w:tc>
           <w:tcPr>
-            <w:tcW w:w="4176" w:type="dxa"/>
+            <w:tcW w:w="5040" w:type="dxa"/>
           </w:tcPr>
           <w:p>
             <w:pPr>
@@ -2201,7 +2206,7 @@
                 <w:rFonts w:ascii="Manrope" w:hAnsi="Manrope"/>
                 <w:sz w:val="20"/>
               </w:rPr>
-              <w:t>Ongoing collaboration is central to good partnership.</w:t>
+              <w:t>Reinforces the importance of ongoing collaboration between home and school.</w:t>
             </w:r>
           </w:p>
           <w:p>
@@ -2213,7 +2218,7 @@
                 <w:rFonts w:ascii="Manrope" w:hAnsi="Manrope"/>
                 <w:sz w:val="20"/>
               </w:rPr>
-              <w:t>Shared goals and communication support better outcomes.</w:t>
+              <w:t>Highlights communication, trust, and a shared focus on the young person's needs and goals.</w:t>
             </w:r>
           </w:p>
           <w:p>
@@ -2225,7 +2230,7 @@
                 <w:rFonts w:ascii="Manrope" w:hAnsi="Manrope"/>
                 <w:sz w:val="20"/>
               </w:rPr>
-              <w:t>The young person remains the focus of partnership work.</w:t>
+              <w:t>Leaves participants with a concrete picture of positive partnership in action.</w:t>
             </w:r>
           </w:p>
         </w:tc>
@@ -2415,31 +2420,31 @@
       </w:rPr>
     </w:lvl>
   </w:abstractNum>
-  <w:num w:numId="1" w16cid:durableId="878737069">
+  <w:num w:numId="1" w16cid:durableId="1943830138">
     <w:abstractNumId w:val="8"/>
   </w:num>
-  <w:num w:numId="2" w16cid:durableId="155458400">
+  <w:num w:numId="2" w16cid:durableId="624048832">
     <w:abstractNumId w:val="6"/>
   </w:num>
-  <w:num w:numId="3" w16cid:durableId="1542933447">
+  <w:num w:numId="3" w16cid:durableId="2057388767">
     <w:abstractNumId w:val="5"/>
   </w:num>
-  <w:num w:numId="4" w16cid:durableId="1349064603">
+  <w:num w:numId="4" w16cid:durableId="31734259">
     <w:abstractNumId w:val="4"/>
   </w:num>
-  <w:num w:numId="5" w16cid:durableId="273831441">
+  <w:num w:numId="5" w16cid:durableId="1241595430">
     <w:abstractNumId w:val="7"/>
   </w:num>
-  <w:num w:numId="6" w16cid:durableId="1943759020">
+  <w:num w:numId="6" w16cid:durableId="269242714">
     <w:abstractNumId w:val="3"/>
   </w:num>
-  <w:num w:numId="7" w16cid:durableId="2025158708">
+  <w:num w:numId="7" w16cid:durableId="1443452484">
     <w:abstractNumId w:val="2"/>
   </w:num>
-  <w:num w:numId="8" w16cid:durableId="1777602835">
+  <w:num w:numId="8" w16cid:durableId="1317342943">
     <w:abstractNumId w:val="1"/>
   </w:num>
-  <w:num w:numId="9" w16cid:durableId="1969778445">
+  <w:num w:numId="9" w16cid:durableId="507210632">
     <w:abstractNumId w:val="0"/>
   </w:num>
 </w:numbering>

</xml_diff>